<commit_message>
docs: finalize frozen prompt terminology
</commit_message>
<xml_diff>
--- a/reports/基于MAF的HiddenBench多智能体正确性诊断与错误链路分析_老师问题全部修订版_2026-08-20-v2.docx
+++ b/reports/基于MAF的HiddenBench多智能体正确性诊断与错误链路分析_老师问题全部修订版_2026-08-20-v2.docx
@@ -16146,7 +16146,7 @@
           <w:color w:val="17365D"/>
           <w:sz w:val="24"/>
         </w:rPr>
-        <w:t>B.3  来源事实包披露审计 Prompt（冻结原始模板；原文保留）</w:t>
+        <w:t>B.3 来源事实包披露审计 Prompt（冻结原始模板；原文保留）</w:t>
       </w:r>
     </w:p>
     <w:p>
@@ -16158,9 +16158,10 @@
           <w:rFonts w:ascii="Calibri" w:hAnsi="Calibri" w:eastAsia="Microsoft YaHei"/>
           <w:b w:val="0"/>
           <w:i w:val="0"/>
+          <w:color w:val="5B6573"/>
           <w:sz w:val="16"/>
         </w:rPr>
-        <w:t>说明：下面保留冻结实验使用的原始 Prompt。其中“ATOMIC PRIVATE FACTS”是冻结 Prompt 的历史字段名；在本文口径中它对应来源事实包，不等于 clause-level 分句命题。</w:t>
+        <w:t>说明：下面保留冻结实验使用的原始 Prompt。其中“ATOMIC PRIVATE FACTS”是冻结 Prompt 的历史字段名；在本文口径中它对应来源事实包，不属于逐分句金标准命题。</w:t>
       </w:r>
     </w:p>
     <w:p>

</xml_diff>